<commit_message>
Updating Design Documents and Updating Control FSM
</commit_message>
<xml_diff>
--- a/Specification_Documents/UART_Controlled_Memory_Interface.docx
+++ b/Specification_Documents/UART_Controlled_Memory_Interface.docx
@@ -127,7 +127,7 @@
         <w:rPr>
           <w:sz w:val="32"/>
         </w:rPr>
-        <w:t>•  8 × 8 Receive and Transmit FIFOs</w:t>
+        <w:t>•  Shared 8 × 8 Synchronous FIFO Module (RX and TX Instances)</w:t>
       </w:r>
     </w:p>
     <w:p>
@@ -139,7 +139,7 @@
         <w:rPr>
           <w:sz w:val="32"/>
         </w:rPr>
-        <w:t>•  Three-State Control FSM / Command Decoder</w:t>
+        <w:t>•  Five-State Control FSM / Command Decoder</w:t>
       </w:r>
     </w:p>
     <w:p>
@@ -421,7 +421,7 @@
                 <w:sz w:val="32"/>
                 <w:szCs w:val="32"/>
               </w:rPr>
-              <w:t>2</w:t>
+              <w:t>3</w:t>
             </w:r>
             <w:r>
               <w:rPr>
@@ -530,7 +530,7 @@
                 <w:sz w:val="32"/>
                 <w:szCs w:val="32"/>
               </w:rPr>
-              <w:t>3</w:t>
+              <w:t>4</w:t>
             </w:r>
             <w:r>
               <w:rPr>
@@ -639,7 +639,7 @@
                 <w:sz w:val="32"/>
                 <w:szCs w:val="32"/>
               </w:rPr>
-              <w:t>5</w:t>
+              <w:t>6</w:t>
             </w:r>
             <w:r>
               <w:rPr>
@@ -748,7 +748,7 @@
                 <w:sz w:val="32"/>
                 <w:szCs w:val="32"/>
               </w:rPr>
-              <w:t>6</w:t>
+              <w:t>7</w:t>
             </w:r>
             <w:r>
               <w:rPr>
@@ -893,26 +893,31 @@
       <w:pPr>
         <w:spacing w:after="100" w:line="360" w:lineRule="auto"/>
         <w:jc w:val="both"/>
-        <w:rPr>
-          <w:sz w:val="24"/>
-          <w:szCs w:val="24"/>
-        </w:rPr>
+      </w:pPr>
+      <w:r>
+        <w:t>The design implements a UART-controlled 16 × 8 memory interface using UART RX, two instances of a shared 8 × 8 synchronous FIFO module, a five-state control FSM, a 16 × 8 dual-port memory, and UART TX. Baud-rate generation is intentionally omitted; one serial bit is transferred per system-clock cycle. FIFO reads use a registered data output, so command decoding, write-data transfer, and TX loading are sequenced on clock boundaries for deterministic synchronization.</w:t>
+      </w:r>
+    </w:p>
+    <w:p>
+      <w:pPr>
+        <w:spacing w:before="20" w:after="40" w:line="360" w:lineRule="auto"/>
+        <w:jc w:val="center"/>
       </w:pPr>
       <w:r>
         <w:rPr>
           <w:noProof/>
         </w:rPr>
         <w:drawing>
-          <wp:anchor distT="0" distB="0" distL="114300" distR="114300" simplePos="0" relativeHeight="251664384" behindDoc="0" locked="0" layoutInCell="1" allowOverlap="1" wp14:anchorId="24532DD4" wp14:editId="5D8C511E">
+          <wp:anchor distT="0" distB="0" distL="114300" distR="114300" simplePos="0" relativeHeight="251658240" behindDoc="0" locked="0" layoutInCell="1" allowOverlap="1" wp14:anchorId="24532DD4" wp14:editId="755DB859">
             <wp:simplePos x="0" y="0"/>
             <wp:positionH relativeFrom="column">
-              <wp:posOffset>-168469</wp:posOffset>
+              <wp:posOffset>8890</wp:posOffset>
             </wp:positionH>
             <wp:positionV relativeFrom="paragraph">
-              <wp:posOffset>1351584</wp:posOffset>
+              <wp:posOffset>176530</wp:posOffset>
             </wp:positionV>
-            <wp:extent cx="6881357" cy="3390900"/>
-            <wp:effectExtent l="171450" t="171450" r="377190" b="374650"/>
+            <wp:extent cx="6559550" cy="2945765"/>
+            <wp:effectExtent l="171450" t="171450" r="374650" b="387985"/>
             <wp:wrapNone/>
             <wp:docPr id="1" name="Picture 1"/>
             <wp:cNvGraphicFramePr>
@@ -934,7 +939,7 @@
                   <pic:spPr>
                     <a:xfrm>
                       <a:off x="0" y="0"/>
-                      <a:ext cx="6881357" cy="3390900"/>
+                      <a:ext cx="6559550" cy="2945765"/>
                     </a:xfrm>
                     <a:prstGeom prst="rect">
                       <a:avLst/>
@@ -964,29 +969,6 @@
           </wp:anchor>
         </w:drawing>
       </w:r>
-      <w:r>
-        <w:rPr>
-          <w:sz w:val="24"/>
-          <w:szCs w:val="24"/>
-        </w:rPr>
-        <w:t>The design implements a UART-controlled 16 × 8 memory interface using a serial receive path, receive FIFO, three-state control FSM, dual-port memory, transmit FIFO, and serial transmit path. The design intentionally omits baud-rate generation; one serial bit is transferred per system-clock cycle. Blue connections in the diagrams represent data or address buses, while red connections represent control and handshake signals.</w:t>
-      </w:r>
-    </w:p>
-    <w:p>
-      <w:pPr>
-        <w:spacing w:before="20" w:after="40" w:line="360" w:lineRule="auto"/>
-        <w:jc w:val="center"/>
-      </w:pPr>
-    </w:p>
-    <w:p>
-      <w:pPr>
-        <w:spacing w:after="120" w:line="360" w:lineRule="auto"/>
-        <w:jc w:val="center"/>
-        <w:rPr>
-          <w:i/>
-          <w:sz w:val="21"/>
-        </w:rPr>
-      </w:pPr>
     </w:p>
     <w:p>
       <w:pPr>
@@ -1108,209 +1090,149 @@
       <w:pPr>
         <w:spacing w:line="360" w:lineRule="auto"/>
         <w:jc w:val="both"/>
-        <w:rPr>
-          <w:sz w:val="24"/>
-          <w:szCs w:val="24"/>
-        </w:rPr>
       </w:pPr>
       <w:r>
         <w:rPr>
           <w:b/>
+          <w:sz w:val="24"/>
         </w:rPr>
         <w:br/>
       </w:r>
       <w:r>
         <w:rPr>
           <w:b/>
-          <w:sz w:val="24"/>
-          <w:szCs w:val="24"/>
         </w:rPr>
         <w:t xml:space="preserve">UART RX. </w:t>
       </w:r>
       <w:r>
-        <w:rPr>
-          <w:sz w:val="24"/>
-          <w:szCs w:val="24"/>
-        </w:rPr>
-        <w:t>Receives serial_rx, reconstructs each 8-bit byte, and asserts rx_valid when a complete byte is available. The byte is forwarded to the RX FIFO through rx_</w:t>
+        <w:t>Receives serial_rx, captures the start bit, eight LSB-first data bits, and stop bit using the IDLE/DATA/STOP FSM, then pulses rx_valid with the completed rx_</w:t>
       </w:r>
       <w:proofErr w:type="gramStart"/>
       <w:r>
-        <w:rPr>
-          <w:sz w:val="24"/>
-          <w:szCs w:val="24"/>
-        </w:rPr>
         <w:t>data[</w:t>
       </w:r>
       <w:proofErr w:type="gramEnd"/>
       <w:r>
-        <w:rPr>
-          <w:sz w:val="24"/>
-          <w:szCs w:val="24"/>
-        </w:rPr>
-        <w:t>7:0].</w:t>
+        <w:t>7:0] byte.</w:t>
       </w:r>
     </w:p>
     <w:p>
       <w:pPr>
         <w:spacing w:line="360" w:lineRule="auto"/>
         <w:jc w:val="both"/>
-        <w:rPr>
-          <w:sz w:val="24"/>
-          <w:szCs w:val="24"/>
-        </w:rPr>
       </w:pPr>
       <w:r>
         <w:rPr>
           <w:b/>
-          <w:sz w:val="24"/>
-          <w:szCs w:val="24"/>
         </w:rPr>
         <w:t xml:space="preserve">RX FIFO. </w:t>
       </w:r>
+      <w:proofErr w:type="gramStart"/>
       <w:r>
-        <w:rPr>
-          <w:sz w:val="24"/>
-          <w:szCs w:val="24"/>
-        </w:rPr>
-        <w:t xml:space="preserve">Buffers command and </w:t>
+        <w:t>Uses</w:t>
+      </w:r>
+      <w:proofErr w:type="gramEnd"/>
+      <w:r>
+        <w:t xml:space="preserve"> the generic fifo module as an 8 × 8 synchronous </w:t>
       </w:r>
       <w:proofErr w:type="gramStart"/>
       <w:r>
-        <w:rPr>
-          <w:sz w:val="24"/>
-          <w:szCs w:val="24"/>
-        </w:rPr>
-        <w:t>write-data</w:t>
+        <w:t>buffer</w:t>
       </w:r>
       <w:proofErr w:type="gramEnd"/>
       <w:r>
-        <w:rPr>
-          <w:sz w:val="24"/>
-          <w:szCs w:val="24"/>
-        </w:rPr>
-        <w:t xml:space="preserve"> bytes so that reception is independent of the controller processing rate. It reports rx_fifo_empty/full and supplies the memory write-data path directly.</w:t>
+        <w:t>. A write stores rx_data when rx_valid is asserted. A read transfers the current FIFO entry into the registered data_out and advances rd_ptr; fifo_empty and fifo_full are generated from the occupancy count.</w:t>
       </w:r>
     </w:p>
     <w:p>
       <w:pPr>
         <w:spacing w:line="360" w:lineRule="auto"/>
         <w:jc w:val="both"/>
-        <w:rPr>
-          <w:sz w:val="24"/>
-          <w:szCs w:val="24"/>
-        </w:rPr>
       </w:pPr>
       <w:r>
         <w:rPr>
           <w:b/>
-          <w:sz w:val="24"/>
-          <w:szCs w:val="24"/>
         </w:rPr>
         <w:t xml:space="preserve">Control Logic. </w:t>
       </w:r>
       <w:r>
-        <w:rPr>
-          <w:sz w:val="24"/>
-          <w:szCs w:val="24"/>
-        </w:rPr>
-        <w:t>Decodes the command fields, controls FIFO reads, generates the read/write enables, and maintains the current 4-bit memory address and remaining-byte count. It does not carry the payload data path.</w:t>
+        <w:t xml:space="preserve">Implements a five-state, three-block FSM. WAIT_CMD requests the command byte, DECODE_CMD interprets </w:t>
+      </w:r>
+      <w:proofErr w:type="gramStart"/>
+      <w:r>
+        <w:t>Count[</w:t>
+      </w:r>
+      <w:proofErr w:type="gramEnd"/>
+      <w:r>
+        <w:t xml:space="preserve">7:5], </w:t>
+      </w:r>
+      <w:proofErr w:type="gramStart"/>
+      <w:r>
+        <w:t>Address[</w:t>
+      </w:r>
+      <w:proofErr w:type="gramEnd"/>
+      <w:r>
+        <w:t>4:1], and W/</w:t>
+      </w:r>
+      <w:proofErr w:type="gramStart"/>
+      <w:r>
+        <w:t>R[</w:t>
+      </w:r>
+      <w:proofErr w:type="gramEnd"/>
+      <w:r>
+        <w:t>0], WRITE_FETCH obtains each registered write-data byte, WRITE_DATA performs the synchronous memory write, and READ_DATA transfers memory data into the TX FIFO. The controller maintains current_addr and bytes_left and generates all FIFO and memory control signals.</w:t>
       </w:r>
       <w:r>
-        <w:rPr>
-          <w:sz w:val="24"/>
-          <w:szCs w:val="24"/>
-        </w:rPr>
         <w:br/>
       </w:r>
       <w:r>
         <w:rPr>
           <w:b/>
-          <w:sz w:val="24"/>
-          <w:szCs w:val="24"/>
         </w:rPr>
         <w:t xml:space="preserve">2-Port Memory. </w:t>
       </w:r>
       <w:r>
-        <w:rPr>
-          <w:sz w:val="24"/>
-          <w:szCs w:val="24"/>
-        </w:rPr>
-        <w:t xml:space="preserve">Contains sixteen 8-bit locations with one write port and one read port. Write </w:t>
+        <w:t>Contains sixteen 8-bit locations. Writes are synchronous to clk through mem_wr_en, mem_wr_</w:t>
       </w:r>
       <w:proofErr w:type="gramStart"/>
       <w:r>
-        <w:rPr>
-          <w:sz w:val="24"/>
-          <w:szCs w:val="24"/>
-        </w:rPr>
-        <w:t>data arrives</w:t>
+        <w:t>addr[</w:t>
       </w:r>
       <w:proofErr w:type="gramEnd"/>
       <w:r>
-        <w:rPr>
-          <w:sz w:val="24"/>
-          <w:szCs w:val="24"/>
-        </w:rPr>
-        <w:t xml:space="preserve"> directly from the RX FIFO, while </w:t>
+        <w:t>3:0], and mem_wr_</w:t>
       </w:r>
       <w:proofErr w:type="gramStart"/>
       <w:r>
-        <w:rPr>
-          <w:sz w:val="24"/>
-          <w:szCs w:val="24"/>
-        </w:rPr>
-        <w:t>read</w:t>
+        <w:t>data[</w:t>
       </w:r>
       <w:proofErr w:type="gramEnd"/>
       <w:r>
-        <w:rPr>
-          <w:sz w:val="24"/>
-          <w:szCs w:val="24"/>
-        </w:rPr>
-        <w:t xml:space="preserve"> data goes directly to the TX FIFO. Four-bit address arithmetic naturally wraps from 15 back to 0.</w:t>
+        <w:t>7:0]. Reads are combinational when mem_rd_en is asserted, and mem_rd_</w:t>
+      </w:r>
+      <w:proofErr w:type="gramStart"/>
+      <w:r>
+        <w:t>data[</w:t>
+      </w:r>
+      <w:proofErr w:type="gramEnd"/>
+      <w:r>
+        <w:t>7:0] feeds the TX FIFO directly. Four-bit address arithmetic naturally wraps from 15 back to 0.</w:t>
       </w:r>
     </w:p>
     <w:p>
       <w:pPr>
         <w:spacing w:line="360" w:lineRule="auto"/>
         <w:jc w:val="both"/>
-        <w:rPr>
-          <w:sz w:val="24"/>
-          <w:szCs w:val="24"/>
-        </w:rPr>
       </w:pPr>
       <w:r>
         <w:rPr>
           <w:b/>
-          <w:sz w:val="24"/>
-          <w:szCs w:val="24"/>
         </w:rPr>
         <w:lastRenderedPageBreak/>
         <w:t xml:space="preserve">TX FIFO and UART TX. </w:t>
       </w:r>
       <w:r>
-        <w:rPr>
-          <w:sz w:val="24"/>
-          <w:szCs w:val="24"/>
-        </w:rPr>
-        <w:t xml:space="preserve">The TX FIFO buffers bytes returned by memory. UART TX removes the oldest byte when available and converts it from parallel form to </w:t>
-      </w:r>
-      <w:proofErr w:type="spellStart"/>
-      <w:r>
-        <w:rPr>
-          <w:sz w:val="24"/>
-          <w:szCs w:val="24"/>
-        </w:rPr>
-        <w:t>serial_tx</w:t>
-      </w:r>
-      <w:proofErr w:type="spellEnd"/>
-      <w:r>
-        <w:rPr>
-          <w:sz w:val="24"/>
-          <w:szCs w:val="24"/>
-        </w:rPr>
-        <w:t>.</w:t>
+        <w:t>The second instance of the generic FIFO buffers memory-read bytes. UART TX asserts tx_fifo_rd_en while idle, then captures the FIFO's registered tx_data during START before transmitting the eight data bits and STOP bit. This prevents the FIFO pointer from advancing before the transmitter has a valid byte.</w:t>
       </w:r>
     </w:p>
     <w:p>
@@ -1354,16 +1276,16 @@
       <w:pPr>
         <w:spacing w:after="100" w:line="360" w:lineRule="auto"/>
         <w:jc w:val="both"/>
+        <w:rPr>
+          <w:sz w:val="20"/>
+          <w:szCs w:val="20"/>
+        </w:rPr>
       </w:pPr>
       <w:r>
         <w:rPr>
-          <w:sz w:val="24"/>
-          <w:szCs w:val="24"/>
+          <w:szCs w:val="20"/>
         </w:rPr>
-        <w:t>The controller uses only three states: WAIT_CMD, WRITE_DATA, and READ_DATA. This keeps the control path small because command decoding is performed when the command byte is at the head of the RX FIFO, while payload data moves directly between the FIFOs and memory</w:t>
-      </w:r>
-      <w:r>
-        <w:t>.</w:t>
+        <w:t>The updated controller uses five states: WAIT_CMD, DECODE_CMD, WRITE_FETCH, WRITE_DATA, and READ_DATA. The two added states are required by the registered-output FIFO. A FIFO read is requested first; the returned byte is then decoded or consumed on the following state, avoiding same-edge read/use timing conflicts.</w:t>
       </w:r>
     </w:p>
     <w:p>
@@ -1546,7 +1468,7 @@
           <w:i/>
           <w:sz w:val="21"/>
         </w:rPr>
-        <w:t>Figure 2. Three-state control FSM used by the controller.</w:t>
+        <w:t>Figure 2. Updated five-state control FSM used with the synchronous registered-output FIFO.</w:t>
       </w:r>
     </w:p>
     <w:p>
@@ -1564,153 +1486,98 @@
       <w:pPr>
         <w:spacing w:line="360" w:lineRule="auto"/>
         <w:jc w:val="both"/>
-        <w:rPr>
-          <w:sz w:val="24"/>
-          <w:szCs w:val="24"/>
-        </w:rPr>
       </w:pPr>
       <w:r>
         <w:rPr>
           <w:b/>
-          <w:sz w:val="24"/>
-          <w:szCs w:val="24"/>
+          <w:szCs w:val="20"/>
         </w:rPr>
         <w:t xml:space="preserve">WAIT_CMD. </w:t>
       </w:r>
       <w:r>
         <w:rPr>
-          <w:sz w:val="24"/>
-          <w:szCs w:val="24"/>
+          <w:szCs w:val="20"/>
         </w:rPr>
-        <w:t>This is the reset and idle state. If rx_fifo_empty is high, the controller remains in WAIT_CMD. When a command byte is present, the controller reads it, loads the starting address from bits [4:1], forms the transfer count from bits [7:5] plus one, and examines bit [0]. A value of 1 selects WRITE_DATA; a value of 0 selects READ_DATA.</w:t>
+        <w:t>Reset and idle state. If rx_fifo_empty = 1, the FSM remains here. When a command is available, rx_fifo_rd_en is asserted and the next state becomes DECODE_CMD.</w:t>
       </w:r>
     </w:p>
     <w:p>
       <w:pPr>
         <w:spacing w:line="360" w:lineRule="auto"/>
         <w:jc w:val="both"/>
-        <w:rPr>
-          <w:sz w:val="24"/>
-          <w:szCs w:val="24"/>
-        </w:rPr>
       </w:pPr>
       <w:r>
         <w:rPr>
           <w:b/>
-          <w:sz w:val="24"/>
-          <w:szCs w:val="24"/>
+          <w:szCs w:val="20"/>
+        </w:rPr>
+        <w:t xml:space="preserve">DECODE_CMD. </w:t>
+      </w:r>
+      <w:r>
+        <w:rPr>
+          <w:szCs w:val="20"/>
+        </w:rPr>
+        <w:t>The registered FIFO output now contains the command byte. The controller loads current_addr from bits [4:1], sets bytes_left to Count[7:5] + 1, and uses W/R[0] to select WRITE_FETCH for a write command or READ_DATA for a read command.</w:t>
+      </w:r>
+    </w:p>
+    <w:p>
+      <w:pPr>
+        <w:spacing w:line="360" w:lineRule="auto"/>
+        <w:jc w:val="both"/>
+      </w:pPr>
+      <w:r>
+        <w:rPr>
+          <w:b/>
+          <w:szCs w:val="20"/>
+        </w:rPr>
+        <w:t xml:space="preserve">WRITE_FETCH. </w:t>
+      </w:r>
+      <w:r>
+        <w:rPr>
+          <w:szCs w:val="20"/>
+        </w:rPr>
+        <w:t>Waits for a payload byte in the RX FIFO. When data is available, rx_fifo_rd_en is asserted so the byte is transferred to the FIFO's registered output, then the FSM advances to WRITE_DATA.</w:t>
+      </w:r>
+    </w:p>
+    <w:p>
+      <w:pPr>
+        <w:spacing w:line="360" w:lineRule="auto"/>
+        <w:jc w:val="both"/>
+      </w:pPr>
+      <w:r>
+        <w:rPr>
+          <w:b/>
+          <w:szCs w:val="20"/>
         </w:rPr>
         <w:t xml:space="preserve">WRITE_DATA. </w:t>
       </w:r>
       <w:r>
         <w:rPr>
-          <w:sz w:val="24"/>
-          <w:szCs w:val="24"/>
+          <w:szCs w:val="20"/>
         </w:rPr>
-        <w:t>The controller waits until the RX FIFO contains a payload byte. For each available byte it asserts rx_fifo_rd_en and mem_wr_en, presents current_addr on mem_wr_</w:t>
-      </w:r>
-      <w:proofErr w:type="gramStart"/>
-      <w:r>
-        <w:rPr>
-          <w:sz w:val="24"/>
-          <w:szCs w:val="24"/>
-        </w:rPr>
-        <w:t>addr[</w:t>
-      </w:r>
-      <w:proofErr w:type="gramEnd"/>
-      <w:r>
-        <w:rPr>
-          <w:sz w:val="24"/>
-          <w:szCs w:val="24"/>
-        </w:rPr>
-        <w:t xml:space="preserve">3:0], decrements bytes_left, and advances the address. If bytes_left equals one, the final byte is </w:t>
-      </w:r>
-      <w:proofErr w:type="gramStart"/>
-      <w:r>
-        <w:rPr>
-          <w:sz w:val="24"/>
-          <w:szCs w:val="24"/>
-        </w:rPr>
-        <w:t>written</w:t>
-      </w:r>
-      <w:proofErr w:type="gramEnd"/>
-      <w:r>
-        <w:rPr>
-          <w:sz w:val="24"/>
-          <w:szCs w:val="24"/>
-        </w:rPr>
-        <w:t xml:space="preserve"> and the FSM returns to WAIT_CMD.</w:t>
+        <w:t>Asserts mem_wr_en and writes the fetched byte to mem_wr_addr = current_addr on the rising clock edge. If bytes_left = 1, the transfer is complete and the FSM returns to WAIT_CMD; otherwise the count is decremented, the 4-bit address is incremented, and the FSM returns to WRITE_FETCH.</w:t>
       </w:r>
     </w:p>
     <w:p>
       <w:pPr>
-        <w:spacing w:line="360" w:lineRule="auto"/>
+        <w:spacing w:after="0" w:line="360" w:lineRule="auto"/>
         <w:jc w:val="both"/>
-        <w:rPr>
-          <w:sz w:val="24"/>
-          <w:szCs w:val="24"/>
-        </w:rPr>
-      </w:pPr>
-    </w:p>
-    <w:p>
-      <w:pPr>
-        <w:spacing w:line="360" w:lineRule="auto"/>
-        <w:jc w:val="both"/>
-        <w:rPr>
-          <w:sz w:val="24"/>
-          <w:szCs w:val="24"/>
-        </w:rPr>
-      </w:pPr>
+      </w:pPr>
+      <w:bookmarkStart w:id="2" w:name="_Toc242382447"/>
       <w:r>
         <w:rPr>
           <w:b/>
-          <w:sz w:val="24"/>
-          <w:szCs w:val="24"/>
+          <w:szCs w:val="20"/>
         </w:rPr>
         <w:lastRenderedPageBreak/>
         <w:t xml:space="preserve">READ_DATA. </w:t>
       </w:r>
       <w:r>
         <w:rPr>
-          <w:sz w:val="24"/>
-          <w:szCs w:val="24"/>
+          <w:szCs w:val="20"/>
         </w:rPr>
-        <w:t>The controller waits until the TX FIFO has space. It then asserts mem_rd_en and tx_fifo_wr_en while presenting current_addr on mem_rd_</w:t>
+        <w:t>If tx_fifo_full = 1, the FSM waits. When space is available, mem_rd_en and tx_fifo_wr_en are asserted together so the combinational memory value is captured by the TX FIFO on the rising edge. The count/address are then advanced or, after the final byte, the FSM returns to WAIT_CMD. Because current_addr is 4 bits, burst accesses wrap automatically from 15 to 0.</w:t>
       </w:r>
-      <w:proofErr w:type="gramStart"/>
-      <w:r>
-        <w:rPr>
-          <w:sz w:val="24"/>
-          <w:szCs w:val="24"/>
-        </w:rPr>
-        <w:t>addr[</w:t>
-      </w:r>
-      <w:proofErr w:type="gramEnd"/>
-      <w:r>
-        <w:rPr>
-          <w:sz w:val="24"/>
-          <w:szCs w:val="24"/>
-        </w:rPr>
-        <w:t>3:0]. The memory byte is written directly into the TX FIFO. The address and count advance after each transfer, and the FSM returns to WAIT_CMD after the final byte.</w:t>
-      </w:r>
-    </w:p>
-    <w:p>
-      <w:pPr>
-        <w:spacing w:after="0" w:line="360" w:lineRule="auto"/>
-        <w:jc w:val="both"/>
-        <w:rPr>
-          <w:sz w:val="24"/>
-          <w:szCs w:val="24"/>
-        </w:rPr>
-      </w:pPr>
-      <w:r>
-        <w:rPr>
-          <w:sz w:val="24"/>
-          <w:szCs w:val="24"/>
-        </w:rPr>
-        <w:t>The 4-bit current address register implements circular addressing automatically. For example, a four-byte transfer beginning at address 14 accesses locations 14, 15, 0, and 1. FIFO empty/full conditions therefore act as the flow-control conditions that pause the write or read sequence without introducing additional states.</w:t>
-      </w:r>
-      <w:bookmarkStart w:id="2" w:name="_Toc242382447"/>
     </w:p>
     <w:p>
       <w:pPr>
@@ -1741,33 +1608,12 @@
       <w:pPr>
         <w:spacing w:after="100" w:line="360" w:lineRule="auto"/>
         <w:jc w:val="both"/>
-        <w:rPr>
-          <w:sz w:val="24"/>
-          <w:szCs w:val="24"/>
-        </w:rPr>
       </w:pPr>
       <w:r>
         <w:rPr>
-          <w:sz w:val="24"/>
-          <w:szCs w:val="24"/>
+          <w:szCs w:val="20"/>
         </w:rPr>
-        <w:t xml:space="preserve">The micro-architecture expands the functional blocks into the registers, counters, storage arrays, and local control used in the Verilog implementation. </w:t>
-      </w:r>
-      <w:proofErr w:type="gramStart"/>
-      <w:r>
-        <w:rPr>
-          <w:sz w:val="24"/>
-          <w:szCs w:val="24"/>
-        </w:rPr>
-        <w:t>The external</w:t>
-      </w:r>
-      <w:proofErr w:type="gramEnd"/>
-      <w:r>
-        <w:rPr>
-          <w:sz w:val="24"/>
-          <w:szCs w:val="24"/>
-        </w:rPr>
-        <w:t xml:space="preserve"> behavior remains identical to the overall block diagram; the purpose of this view is to show how each module realizes that behavior internally.</w:t>
+        <w:t>The updated micro-architecture reflects the actual Verilog modules: a three-state UART receiver, one reusable synchronous FIFO instantiated twice, a five-state three-block controller, a 16 × 8 memory with synchronous write and combinational read, and a four-state UART transmitter. The diagram also shows where the registered FIFO outputs introduce the clock-to-clock sequencing used by the controller and transmitter.</w:t>
       </w:r>
     </w:p>
     <w:p>
@@ -1782,18 +1628,18 @@
           <w:szCs w:val="21"/>
         </w:rPr>
         <w:drawing>
-          <wp:anchor distT="0" distB="0" distL="114300" distR="114300" simplePos="0" relativeHeight="251651072" behindDoc="0" locked="0" layoutInCell="1" allowOverlap="1" wp14:anchorId="71E4685E" wp14:editId="5135E46E">
+          <wp:anchor distT="0" distB="0" distL="114300" distR="114300" simplePos="0" relativeHeight="251661312" behindDoc="0" locked="0" layoutInCell="1" allowOverlap="1" wp14:anchorId="22AE095E" wp14:editId="7980331B">
             <wp:simplePos x="0" y="0"/>
             <wp:positionH relativeFrom="column">
-              <wp:posOffset>2540</wp:posOffset>
+              <wp:posOffset>-143510</wp:posOffset>
             </wp:positionH>
             <wp:positionV relativeFrom="paragraph">
-              <wp:posOffset>173990</wp:posOffset>
+              <wp:posOffset>177800</wp:posOffset>
             </wp:positionV>
-            <wp:extent cx="6565900" cy="2978150"/>
+            <wp:extent cx="6889750" cy="3549650"/>
             <wp:effectExtent l="171450" t="171450" r="387350" b="374650"/>
             <wp:wrapNone/>
-            <wp:docPr id="3" name="Picture 3"/>
+            <wp:docPr id="4245537" name="Picture 1"/>
             <wp:cNvGraphicFramePr>
               <a:graphicFrameLocks xmlns:a="http://schemas.openxmlformats.org/drawingml/2006/main" noChangeAspect="1"/>
             </wp:cNvGraphicFramePr>
@@ -1801,19 +1647,28 @@
               <a:graphicData uri="http://schemas.openxmlformats.org/drawingml/2006/picture">
                 <pic:pic xmlns:pic="http://schemas.openxmlformats.org/drawingml/2006/picture">
                   <pic:nvPicPr>
-                    <pic:cNvPr id="0" name="UART Memory Interface Micro-Architecture(3).png"/>
-                    <pic:cNvPicPr/>
+                    <pic:cNvPr id="0" name="Picture 1"/>
+                    <pic:cNvPicPr>
+                      <a:picLocks noChangeAspect="1" noChangeArrowheads="1"/>
+                    </pic:cNvPicPr>
                   </pic:nvPicPr>
                   <pic:blipFill>
-                    <a:blip r:embed="rId10"/>
+                    <a:blip r:embed="rId10">
+                      <a:extLst>
+                        <a:ext uri="{28A0092B-C50C-407E-A947-70E740481C1C}">
+                          <a14:useLocalDpi xmlns:a14="http://schemas.microsoft.com/office/drawing/2010/main" val="0"/>
+                        </a:ext>
+                      </a:extLst>
+                    </a:blip>
+                    <a:srcRect/>
                     <a:stretch>
                       <a:fillRect/>
                     </a:stretch>
                   </pic:blipFill>
-                  <pic:spPr>
+                  <pic:spPr bwMode="auto">
                     <a:xfrm>
                       <a:off x="0" y="0"/>
-                      <a:ext cx="6567199" cy="2978739"/>
+                      <a:ext cx="6889750" cy="3549650"/>
                     </a:xfrm>
                     <a:prstGeom prst="rect">
                       <a:avLst/>
@@ -1933,32 +1788,19 @@
           <w:sz w:val="21"/>
         </w:rPr>
       </w:pPr>
-    </w:p>
-    <w:p>
-      <w:pPr>
-        <w:spacing w:after="120" w:line="360" w:lineRule="auto"/>
-        <w:jc w:val="center"/>
-        <w:rPr>
-          <w:i/>
-          <w:sz w:val="21"/>
-        </w:rPr>
-      </w:pPr>
-    </w:p>
-    <w:p>
-      <w:pPr>
-        <w:spacing w:after="120" w:line="360" w:lineRule="auto"/>
-        <w:jc w:val="center"/>
-        <w:rPr>
-          <w:i/>
-          <w:sz w:val="21"/>
-        </w:rPr>
-      </w:pPr>
       <w:r>
         <w:rPr>
           <w:i/>
           <w:sz w:val="21"/>
         </w:rPr>
-        <w:t>Figure 3. Micro-architecture of the UART controlled memory interface.</w:t>
+        <w:br/>
+      </w:r>
+      <w:r>
+        <w:rPr>
+          <w:i/>
+          <w:sz w:val="21"/>
+        </w:rPr>
+        <w:br/>
       </w:r>
       <w:r>
         <w:rPr>
@@ -1970,321 +1812,147 @@
     </w:p>
     <w:p>
       <w:pPr>
+        <w:spacing w:after="120" w:line="360" w:lineRule="auto"/>
+        <w:jc w:val="center"/>
+        <w:rPr>
+          <w:i/>
+          <w:sz w:val="21"/>
+        </w:rPr>
+      </w:pPr>
+    </w:p>
+    <w:p>
+      <w:pPr>
+        <w:spacing w:after="120" w:line="360" w:lineRule="auto"/>
+        <w:jc w:val="center"/>
+        <w:rPr>
+          <w:i/>
+          <w:sz w:val="21"/>
+        </w:rPr>
+      </w:pPr>
+      <w:r>
+        <w:rPr>
+          <w:i/>
+          <w:sz w:val="21"/>
+        </w:rPr>
+        <w:t>Figure 3. Updated micro-architecture corresponding to the current Verilog modules.</w:t>
+      </w:r>
+    </w:p>
+    <w:p>
+      <w:pPr>
+        <w:spacing w:after="120" w:line="360" w:lineRule="auto"/>
+        <w:jc w:val="center"/>
+        <w:rPr>
+          <w:i/>
+          <w:sz w:val="21"/>
+        </w:rPr>
+      </w:pPr>
+    </w:p>
+    <w:p>
+      <w:pPr>
         <w:spacing w:line="360" w:lineRule="auto"/>
         <w:jc w:val="both"/>
-        <w:rPr>
-          <w:sz w:val="24"/>
-          <w:szCs w:val="24"/>
-        </w:rPr>
       </w:pPr>
       <w:r>
         <w:rPr>
           <w:b/>
-          <w:sz w:val="24"/>
-          <w:szCs w:val="24"/>
+          <w:szCs w:val="20"/>
         </w:rPr>
         <w:t xml:space="preserve">UART RX internals. </w:t>
       </w:r>
       <w:r>
         <w:rPr>
-          <w:sz w:val="24"/>
-          <w:szCs w:val="24"/>
+          <w:szCs w:val="20"/>
         </w:rPr>
-        <w:t>The receiver uses a shift register and framing/validation logic to capture the start bit, eight LSB-first data bits, and stop bit. When a complete frame is accepted, rx_data is updated and rx_valid is pulsed for one clock.</w:t>
+        <w:t>The receiver uses IDLE, DATA, and STOP states with an 8-bit shift_reg and 3-bit bit_count. A valid stop bit transfers shift_reg to rx_data and pulses rx_valid for one clock, provided the RX FIFO is not full.</w:t>
       </w:r>
     </w:p>
     <w:p>
       <w:pPr>
         <w:spacing w:line="360" w:lineRule="auto"/>
         <w:jc w:val="both"/>
-        <w:rPr>
-          <w:sz w:val="24"/>
-          <w:szCs w:val="24"/>
-        </w:rPr>
       </w:pPr>
       <w:r>
         <w:rPr>
           <w:b/>
-          <w:sz w:val="24"/>
-          <w:szCs w:val="24"/>
+          <w:szCs w:val="20"/>
         </w:rPr>
-        <w:lastRenderedPageBreak/>
         <w:t xml:space="preserve">FIFO internals. </w:t>
       </w:r>
       <w:r>
         <w:rPr>
-          <w:sz w:val="24"/>
-          <w:szCs w:val="24"/>
+          <w:szCs w:val="20"/>
         </w:rPr>
-        <w:t>Both RX and TX FIFOs use an 8 × 8 storage array, 3-bit read and write pointers, and occupancy/status logic. The pointers wrap naturally after entry 7, while full and empty conditions are derived from the stored-byte count.</w:t>
+        <w:t>RX and TX use the same fifo module. Each instance contains an 8 × 8 fifo_mem array, 3-bit write/read pointers, a 4-bit count, full/empty flags, synchronous write logic, and a registered data_out. fifo_rd_en therefore produces the requested byte after the active clock edge while also advancing rd_ptr.</w:t>
       </w:r>
     </w:p>
     <w:p>
       <w:pPr>
         <w:spacing w:line="360" w:lineRule="auto"/>
         <w:jc w:val="both"/>
-        <w:rPr>
-          <w:sz w:val="24"/>
-          <w:szCs w:val="24"/>
-        </w:rPr>
       </w:pPr>
       <w:r>
         <w:rPr>
           <w:b/>
-          <w:sz w:val="24"/>
-          <w:szCs w:val="24"/>
+          <w:szCs w:val="20"/>
         </w:rPr>
+        <w:lastRenderedPageBreak/>
         <w:t xml:space="preserve">Controller internals. </w:t>
       </w:r>
       <w:r>
         <w:rPr>
-          <w:sz w:val="24"/>
-          <w:szCs w:val="24"/>
+          <w:szCs w:val="20"/>
         </w:rPr>
-        <w:t xml:space="preserve">The command is interpreted as </w:t>
-      </w:r>
-      <w:proofErr w:type="gramStart"/>
-      <w:r>
-        <w:rPr>
-          <w:sz w:val="24"/>
-          <w:szCs w:val="24"/>
-        </w:rPr>
-        <w:t>Count[</w:t>
-      </w:r>
-      <w:proofErr w:type="gramEnd"/>
-      <w:r>
-        <w:rPr>
-          <w:sz w:val="24"/>
-          <w:szCs w:val="24"/>
-        </w:rPr>
-        <w:t xml:space="preserve">7:5], </w:t>
-      </w:r>
-      <w:proofErr w:type="gramStart"/>
-      <w:r>
-        <w:rPr>
-          <w:sz w:val="24"/>
-          <w:szCs w:val="24"/>
-        </w:rPr>
-        <w:t>Address[</w:t>
-      </w:r>
-      <w:proofErr w:type="gramEnd"/>
-      <w:r>
-        <w:rPr>
-          <w:sz w:val="24"/>
-          <w:szCs w:val="24"/>
-        </w:rPr>
-        <w:t>4:1], and W/</w:t>
-      </w:r>
-      <w:proofErr w:type="gramStart"/>
-      <w:r>
-        <w:rPr>
-          <w:sz w:val="24"/>
-          <w:szCs w:val="24"/>
-        </w:rPr>
-        <w:t>R[</w:t>
-      </w:r>
-      <w:proofErr w:type="gramEnd"/>
-      <w:r>
-        <w:rPr>
-          <w:sz w:val="24"/>
-          <w:szCs w:val="24"/>
-        </w:rPr>
-        <w:t>0]. The FSM works with current_addr and bytes_left registers to sequence multi-byte operations and produce the memory and FIFO control signals.</w:t>
+        <w:t>The controller is written as three blocks: state/register logic, output logic, and next-state logic. The 3-bit state register selects WAIT_CMD, DECODE_CMD, WRITE_FETCH, WRITE_DATA, or READ_DATA. current_addr/next_addr and bytes_left/next_bytes_left sequence multi-byte commands.</w:t>
       </w:r>
     </w:p>
     <w:p>
       <w:pPr>
         <w:spacing w:line="360" w:lineRule="auto"/>
         <w:jc w:val="both"/>
-        <w:rPr>
-          <w:sz w:val="24"/>
-          <w:szCs w:val="24"/>
-        </w:rPr>
       </w:pPr>
       <w:r>
         <w:rPr>
           <w:b/>
-          <w:sz w:val="24"/>
-          <w:szCs w:val="24"/>
+          <w:szCs w:val="20"/>
         </w:rPr>
         <w:t xml:space="preserve">Memory internals. </w:t>
       </w:r>
       <w:r>
         <w:rPr>
-          <w:sz w:val="24"/>
-          <w:szCs w:val="24"/>
+          <w:szCs w:val="20"/>
         </w:rPr>
-        <w:t>The 16 × 8 array is accessed through separate read and write ports. The write side uses mem_wr_en and mem_wr_</w:t>
-      </w:r>
-      <w:proofErr w:type="gramStart"/>
-      <w:r>
-        <w:rPr>
-          <w:sz w:val="24"/>
-          <w:szCs w:val="24"/>
-        </w:rPr>
-        <w:t>addr[</w:t>
-      </w:r>
-      <w:proofErr w:type="gramEnd"/>
-      <w:r>
-        <w:rPr>
-          <w:sz w:val="24"/>
-          <w:szCs w:val="24"/>
-        </w:rPr>
-        <w:t>3:0] with mem_wr_</w:t>
-      </w:r>
-      <w:proofErr w:type="gramStart"/>
-      <w:r>
-        <w:rPr>
-          <w:sz w:val="24"/>
-          <w:szCs w:val="24"/>
-        </w:rPr>
-        <w:t>data[</w:t>
-      </w:r>
-      <w:proofErr w:type="gramEnd"/>
-      <w:r>
-        <w:rPr>
-          <w:sz w:val="24"/>
-          <w:szCs w:val="24"/>
-        </w:rPr>
-        <w:t>7:0] from the RX FIFO; the read side uses mem_rd_en and mem_rd_</w:t>
-      </w:r>
-      <w:proofErr w:type="gramStart"/>
-      <w:r>
-        <w:rPr>
-          <w:sz w:val="24"/>
-          <w:szCs w:val="24"/>
-        </w:rPr>
-        <w:t>addr[</w:t>
-      </w:r>
-      <w:proofErr w:type="gramEnd"/>
-      <w:r>
-        <w:rPr>
-          <w:sz w:val="24"/>
-          <w:szCs w:val="24"/>
-        </w:rPr>
-        <w:t>3:0] and sends mem_rd_</w:t>
-      </w:r>
-      <w:proofErr w:type="gramStart"/>
-      <w:r>
-        <w:rPr>
-          <w:sz w:val="24"/>
-          <w:szCs w:val="24"/>
-        </w:rPr>
-        <w:t>data[</w:t>
-      </w:r>
-      <w:proofErr w:type="gramEnd"/>
-      <w:r>
-        <w:rPr>
-          <w:sz w:val="24"/>
-          <w:szCs w:val="24"/>
-        </w:rPr>
-        <w:t>7:0] directly to the TX FIFO.</w:t>
+        <w:t>The 16 × 8 array has a synchronous write path and a combinational read path. mem_wr_en stores mem_wr_data at mem_wr_addr on clk, while mem_rd_en exposes memory[mem_rd_addr] as mem_rd_data for capture by the TX FIFO.</w:t>
       </w:r>
     </w:p>
     <w:p>
       <w:pPr>
         <w:spacing w:line="360" w:lineRule="auto"/>
         <w:jc w:val="both"/>
-        <w:rPr>
-          <w:sz w:val="24"/>
-          <w:szCs w:val="24"/>
-        </w:rPr>
       </w:pPr>
       <w:r>
         <w:rPr>
           <w:b/>
-          <w:sz w:val="24"/>
-          <w:szCs w:val="24"/>
+          <w:szCs w:val="20"/>
         </w:rPr>
         <w:t xml:space="preserve">UART TX internals. </w:t>
       </w:r>
       <w:r>
         <w:rPr>
-          <w:sz w:val="24"/>
-          <w:szCs w:val="24"/>
+          <w:szCs w:val="20"/>
         </w:rPr>
-        <w:t xml:space="preserve">The transmitter accepts an 8-bit FIFO byte, loads it into </w:t>
-      </w:r>
-      <w:proofErr w:type="gramStart"/>
-      <w:r>
-        <w:rPr>
-          <w:sz w:val="24"/>
-          <w:szCs w:val="24"/>
-        </w:rPr>
-        <w:t>its</w:t>
-      </w:r>
-      <w:proofErr w:type="gramEnd"/>
-      <w:r>
-        <w:rPr>
-          <w:sz w:val="24"/>
-          <w:szCs w:val="24"/>
-        </w:rPr>
-        <w:t xml:space="preserve"> transmit path, and serializes the byte with the required start and </w:t>
-      </w:r>
-      <w:proofErr w:type="gramStart"/>
-      <w:r>
-        <w:rPr>
-          <w:sz w:val="24"/>
-          <w:szCs w:val="24"/>
-        </w:rPr>
-        <w:t>stop</w:t>
-      </w:r>
-      <w:proofErr w:type="gramEnd"/>
-      <w:r>
-        <w:rPr>
-          <w:sz w:val="24"/>
-          <w:szCs w:val="24"/>
-        </w:rPr>
-        <w:t xml:space="preserve"> framing. The TX FIFO </w:t>
-      </w:r>
-      <w:proofErr w:type="gramStart"/>
-      <w:r>
-        <w:rPr>
-          <w:sz w:val="24"/>
-          <w:szCs w:val="24"/>
-        </w:rPr>
-        <w:t>read enable</w:t>
-      </w:r>
-      <w:proofErr w:type="gramEnd"/>
-      <w:r>
-        <w:rPr>
-          <w:sz w:val="24"/>
-          <w:szCs w:val="24"/>
-        </w:rPr>
-        <w:t xml:space="preserve"> prevents the next byte from being removed until the transmitter is ready.</w:t>
+        <w:t>The transmitter uses IDLE, START, DATA, and STOP states with a three-block FSM. In IDLE it requests the next TX FIFO byte; during START it captures the now-valid registered tx_data into shift_reg, DATA serializes bits 0 through 7 using bit_count, and STOP returns the line high before the next byte.</w:t>
       </w:r>
     </w:p>
     <w:p>
       <w:pPr>
         <w:spacing w:after="100" w:line="360" w:lineRule="auto"/>
         <w:jc w:val="both"/>
-        <w:rPr>
-          <w:sz w:val="24"/>
-          <w:szCs w:val="24"/>
-        </w:rPr>
       </w:pPr>
       <w:r>
         <w:rPr>
-          <w:sz w:val="24"/>
-          <w:szCs w:val="24"/>
+          <w:szCs w:val="20"/>
         </w:rPr>
-        <w:t xml:space="preserve">Together, these blocks form a compact command-driven serial memory interface. The separation of data paths from the control path keeps the implementation easy to verify: the controller determines when and where a transfer occurs, while the payload bytes move directly through the FIFO-memory </w:t>
-      </w:r>
-      <w:proofErr w:type="spellStart"/>
-      <w:r>
-        <w:rPr>
-          <w:sz w:val="24"/>
-          <w:szCs w:val="24"/>
-        </w:rPr>
-        <w:t>datapaths</w:t>
-      </w:r>
-      <w:proofErr w:type="spellEnd"/>
-      <w:r>
-        <w:rPr>
-          <w:sz w:val="24"/>
-          <w:szCs w:val="24"/>
-        </w:rPr>
-        <w:t>.</w:t>
+        <w:t>At top level, the same fifo module is instantiated as u_rx_fifo and u_tx_fifo. All internal modules use the same clk, so no additional clock-domain synchronizers are required inside the design; synchronization is achieved by the state sequencing around the registered FIFO outputs and the clocked memory/FIFO writes.</w:t>
       </w:r>
     </w:p>
     <w:p>
@@ -2328,17 +1996,12 @@
       <w:pPr>
         <w:spacing w:after="0" w:line="360" w:lineRule="auto"/>
         <w:jc w:val="both"/>
-        <w:rPr>
-          <w:sz w:val="24"/>
-          <w:szCs w:val="24"/>
-        </w:rPr>
       </w:pPr>
       <w:r>
         <w:rPr>
-          <w:sz w:val="24"/>
-          <w:szCs w:val="24"/>
+          <w:szCs w:val="20"/>
         </w:rPr>
-        <w:t>The project implements a modular UART-controlled memory interface in Verilog using a simple serial receive/transmit scheme, independent RX and TX FIFOs, a three-state controller, and a 16 × 8 dual-port memory. The design cleanly separates control from payload data movement, supports multi-byte read and write commands with automatic 4-bit address wrap-around, and uses FIFO full/empty conditions to regulate data flow without adding unnecessary controller states. Overall, the architecture remains compact, understandable, and suitable for directed verification of the required UART-to-memory functionality.</w:t>
+        <w:t>The updated project implements a modular UART-controlled memory interface in Verilog using a simplified one-bit-per-clock serial receive/transmit scheme, two instances of a shared 8 × 8 synchronous FIFO, a five-state control FSM, and a 16 × 8 dual-port memory. The registered FIFO outputs are handled explicitly by DECODE_CMD and WRITE_FETCH on the receive path and by the START state on the transmit path, ensuring that data is captured only after a FIFO read has completed. The design retains multi-byte read/write commands, automatic 4-bit address wrap-around, FIFO-based flow control, and a clear separation between the payload datapath and control logic.</w:t>
       </w:r>
     </w:p>
     <w:sectPr>

</xml_diff>